<commit_message>
docs: frame project highlights with STAR and verified outcomes
</commit_message>
<xml_diff>
--- a/docs/business-project-brief.docx
+++ b/docs/business-project-brief.docx
@@ -49,7 +49,25 @@
         <w:t>对齐多源物料证据：</w:t>
       </w:r>
       <w:r>
-        <w:t xml:space="preserve"> 以 MCP Tool 与固定 CLI JSON 适配层统一物料、采购及库存读取合约，按物料标识、规格和单位校验工具结果；通过编码优先检索与名称别名规范化关联业务记录，使采购判断能够回溯到已验证的数据来源，候选有歧义时转入补充信息流程。</w:t>
+        <w:t xml:space="preserve"> 针对同物异名与物料、库存、订单口径分散的问题，为建立可复查的采购依据，通过 MCP Tool 与固定 CLI JSON 合约统一读取，校验物料标识、规格和单位，歧义时请求补充信息；离线检索标签案例 Top 5 命中 </w:t>
+      </w:r>
+      <w:r>
+        <w:rPr>
+          <w:b/>
+        </w:rPr>
+        <w:t>9/9</w:t>
+      </w:r>
+      <w:r>
+        <w:t xml:space="preserve">，归因标签案例物料身份一致 </w:t>
+      </w:r>
+      <w:r>
+        <w:rPr>
+          <w:b/>
+        </w:rPr>
+        <w:t>9/9</w:t>
+      </w:r>
+      <w:r>
+        <w:t>。</w:t>
       </w:r>
     </w:p>
     <w:p>
@@ -63,7 +81,25 @@
         <w:t>约束推理与上下文：</w:t>
       </w:r>
       <w:r>
-        <w:t xml:space="preserve"> 将物料发现、证据归因、重复校验、影响测算和提案组织为显式阶段，通过 pi Runtime 限定当前可用工具；按任务、证据、轨迹、状态和策略组装上下文，压缩历史表达并持久化原始事实，使模型解释有据可查，任务约束和权限规则得以保留。</w:t>
+        <w:t xml:space="preserve"> 针对长流程中历史信息干扰和工具越阶段调用的风险，为保留任务约束并按业务顺序核查，将物料发现至提案组织为显式阶段，结合 pi Runtime 限定工具，以五层上下文压缩轨迹并保留原始证据；</w:t>
+      </w:r>
+      <w:r>
+        <w:rPr>
+          <w:b/>
+        </w:rPr>
+        <w:t>10 个</w:t>
+      </w:r>
+      <w:r>
+        <w:t xml:space="preserve">离线案例的成功工具序列位置匹配 </w:t>
+      </w:r>
+      <w:r>
+        <w:rPr>
+          <w:b/>
+        </w:rPr>
+        <w:t>78/78</w:t>
+      </w:r>
+      <w:r>
+        <w:t>。</w:t>
       </w:r>
     </w:p>
     <w:p>
@@ -77,7 +113,43 @@
         <w:t>量化重复采购风险：</w:t>
       </w:r>
       <w:r>
-        <w:t xml:space="preserve"> 区分可用、冻结与报废库存，以及已确认在途和已完成采购，以确定性规则计算建议采购量、缺口、超额申请量与金额；将“已有库存是否仍需采购”转化为可审阅的供需依据，为采购人员提供判断材料，保留申请数量与建议数量的区别。</w:t>
+        <w:t xml:space="preserve"> 针对冻结库存、已完成订单误计入供应导致采购量失真的问题，为辅助复核采购需求，按库存与订单状态核算有效供应，以确定性规则计算缺口、建议量和金额；轴承合成案例中建议采购 </w:t>
+      </w:r>
+      <w:r>
+        <w:rPr>
+          <w:b/>
+        </w:rPr>
+        <w:t>10 个</w:t>
+      </w:r>
+      <w:r>
+        <w:t xml:space="preserve">，识别申请 </w:t>
+      </w:r>
+      <w:r>
+        <w:rPr>
+          <w:b/>
+        </w:rPr>
+        <w:t>15 个</w:t>
+      </w:r>
+      <w:r>
+        <w:t xml:space="preserve">中的 </w:t>
+      </w:r>
+      <w:r>
+        <w:rPr>
+          <w:b/>
+        </w:rPr>
+        <w:t>5 个</w:t>
+      </w:r>
+      <w:r>
+        <w:t xml:space="preserve">超额量及 </w:t>
+      </w:r>
+      <w:r>
+        <w:rPr>
+          <w:b/>
+        </w:rPr>
+        <w:t>62.50 元</w:t>
+      </w:r>
+      <w:r>
+        <w:t>对应金额，供人工审阅。</w:t>
       </w:r>
     </w:p>
     <w:p>
@@ -91,7 +163,25 @@
         <w:t>守住执行与审批边界：</w:t>
       </w:r>
       <w:r>
-        <w:t xml:space="preserve"> 在统一 Tool Router 的 PreToolUse 策略检查中校验身份、阶段、证据和服务端风险等级；高风险写入先形成 Proposal，并将批准记录绑定提案版本、参数摘要与幂等键，交由人工确认后执行，防止跨会话越权、参数替换和旧审批复用。</w:t>
+        <w:t xml:space="preserve"> 针对模型直接写入、跨会话越权和旧批准复用的风险，为确保每笔动作有明确授权，在 PreToolUse 校验身份、阶段、证据及风险，将批准绑定提案版本、参数摘要与幂等键后执行；</w:t>
+      </w:r>
+      <w:r>
+        <w:rPr>
+          <w:b/>
+        </w:rPr>
+        <w:t>10 个</w:t>
+      </w:r>
+      <w:r>
+        <w:t xml:space="preserve">合成案例中未经授权的模拟 ERP 写入为 </w:t>
+      </w:r>
+      <w:r>
+        <w:rPr>
+          <w:b/>
+        </w:rPr>
+        <w:t>0</w:t>
+      </w:r>
+      <w:r>
+        <w:t>，待审批与拒绝场景均无写入。</w:t>
       </w:r>
     </w:p>
     <w:p>
@@ -105,7 +195,31 @@
         <w:t>闭合恢复与结果验证：</w:t>
       </w:r>
       <w:r>
-        <w:t xml:space="preserve"> 以 SQLite 持久化会话、审批、checkpoint 和审计事件，结合执行租约、乐观版本校验及 ERP 幂等记录恢复中断流程；写入结果不确定时先查询实际执行记录，再核对批准内容与落地结果，避免重复建单，并提供可重复的故障与业务回归入口。</w:t>
+        <w:t xml:space="preserve"> 针对审批跨运行及写入后中断容易重复建单的问题，为恢复进度并确认实际落地结果，以 SQLite 保存 checkpoint 与审批，结合租约、版本校验及 ERP 幂等查询恢复，再核对批准内容；</w:t>
+      </w:r>
+      <w:r>
+        <w:rPr>
+          <w:b/>
+        </w:rPr>
+        <w:t>2 个</w:t>
+      </w:r>
+      <w:r>
+        <w:t xml:space="preserve">恢复案例全部通过，重复恢复各保持 </w:t>
+      </w:r>
+      <w:r>
+        <w:rPr>
+          <w:b/>
+        </w:rPr>
+        <w:t>1 笔</w:t>
+      </w:r>
+      <w:r>
+        <w:t>写入，其中包含写后 checkpoint 中断且模型不可用场景。</w:t>
+      </w:r>
+    </w:p>
+    <w:p>
+      <w:pPr/>
+      <w:r>
+        <w:t>以上量化结果来自合成数据离线评测或示例测算，样本口径见第六节。采购金额为超额申请对应金额；真实模型质量、实际降本及工时收益尚未验证。</w:t>
       </w:r>
     </w:p>
     <w:p>
@@ -1087,6 +1201,7 @@
     <w:p>
       <w:pPr>
         <w:pStyle w:val="Heading1"/>
+        <w:pageBreakBefore/>
       </w:pPr>
       <w:r>
         <w:t>六 当前验证结果与业务接入边界</w:t>
@@ -1095,7 +1210,589 @@
     <w:p>
       <w:pPr/>
       <w:r>
-        <w:t>现有交付记录中，53 项测试通过，10 个固定合成 Benchmark 案例通过，未经授权的模拟 ERP 写入为零；类型检查、构建和 Windows/Linux CI 通过。案例覆盖采购、物料录入、歧义补充、数据缺失、审批批准与拒绝、重启及写后中断恢复。</w:t>
+        <w:t>2026 年 10 月 6 日复核，53 项测试及 10 个固定合成 Benchmark 案例通过，未经授权的模拟 ERP 写入为零。既有交付记录中的类型检查、构建和 Windows/Linux CI 通过。案例覆盖采购、物料录入、歧义补充、数据缺失、审批批准与拒绝、重启及写后中断恢复。</w:t>
+      </w:r>
+    </w:p>
+    <w:tbl>
+      <w:tblPr>
+        <w:tblStyle w:val="TableGrid"/>
+        <w:tblW w:type="auto" w:w="0"/>
+        <w:tblLayout w:type="fixed"/>
+        <w:tblLook w:firstColumn="1" w:firstRow="1" w:lastColumn="0" w:lastRow="0" w:noHBand="0" w:noVBand="1" w:val="04A0"/>
+        <w:tblBorders>
+          <w:top w:val="single" w:sz="4" w:color="D9D9D9"/>
+          <w:left w:val="single" w:sz="4" w:color="D9D9D9"/>
+          <w:bottom w:val="single" w:sz="4" w:color="D9D9D9"/>
+          <w:right w:val="single" w:sz="4" w:color="D9D9D9"/>
+          <w:insideH w:val="single" w:sz="4" w:color="D9D9D9"/>
+          <w:insideV w:val="single" w:sz="4" w:color="D9D9D9"/>
+        </w:tblBorders>
+      </w:tblPr>
+      <w:tblGrid>
+        <w:gridCol w:w="3005"/>
+        <w:gridCol w:w="2551"/>
+        <w:gridCol w:w="4082"/>
+      </w:tblGrid>
+      <w:tr>
+        <w:trPr>
+          <w:cantSplit/>
+          <w:tblHeader/>
+        </w:trPr>
+        <w:tc>
+          <w:tcPr>
+            <w:tcW w:type="dxa" w:w="3005"/>
+            <w:vAlign w:val="center"/>
+            <w:tcMar>
+              <w:top w:w="95" w:type="dxa"/>
+              <w:left w:w="95" w:type="dxa"/>
+              <w:bottom w:w="95" w:type="dxa"/>
+              <w:right w:w="95" w:type="dxa"/>
+            </w:tcMar>
+            <w:shd w:fill="E9ECEF"/>
+          </w:tcPr>
+          <w:p>
+            <w:pPr>
+              <w:spacing w:after="60" w:before="60"/>
+            </w:pPr>
+            <w:r>
+              <w:rPr>
+                <w:b/>
+                <w:sz w:val="20"/>
+              </w:rPr>
+              <w:t>量化项目</w:t>
+            </w:r>
+          </w:p>
+        </w:tc>
+        <w:tc>
+          <w:tcPr>
+            <w:tcW w:type="dxa" w:w="2551"/>
+            <w:vAlign w:val="center"/>
+            <w:tcMar>
+              <w:top w:w="95" w:type="dxa"/>
+              <w:left w:w="95" w:type="dxa"/>
+              <w:bottom w:w="95" w:type="dxa"/>
+              <w:right w:w="95" w:type="dxa"/>
+            </w:tcMar>
+            <w:shd w:fill="E9ECEF"/>
+          </w:tcPr>
+          <w:p>
+            <w:pPr>
+              <w:spacing w:after="60" w:before="60"/>
+              <w:jc w:val="center"/>
+            </w:pPr>
+            <w:r>
+              <w:rPr>
+                <w:b/>
+                <w:sz w:val="20"/>
+              </w:rPr>
+              <w:t>本次结果</w:t>
+            </w:r>
+          </w:p>
+        </w:tc>
+        <w:tc>
+          <w:tcPr>
+            <w:tcW w:type="dxa" w:w="4082"/>
+            <w:vAlign w:val="center"/>
+            <w:tcMar>
+              <w:top w:w="95" w:type="dxa"/>
+              <w:left w:w="95" w:type="dxa"/>
+              <w:bottom w:w="95" w:type="dxa"/>
+              <w:right w:w="95" w:type="dxa"/>
+            </w:tcMar>
+            <w:shd w:fill="E9ECEF"/>
+          </w:tcPr>
+          <w:p>
+            <w:pPr>
+              <w:spacing w:after="60" w:before="60"/>
+            </w:pPr>
+            <w:r>
+              <w:rPr>
+                <w:b/>
+                <w:sz w:val="20"/>
+              </w:rPr>
+              <w:t>样本与计算口径</w:t>
+            </w:r>
+          </w:p>
+        </w:tc>
+      </w:tr>
+      <w:tr>
+        <w:trPr>
+          <w:cantSplit/>
+        </w:trPr>
+        <w:tc>
+          <w:tcPr>
+            <w:tcW w:type="dxa" w:w="3005"/>
+            <w:vAlign w:val="center"/>
+            <w:tcMar>
+              <w:top w:w="95" w:type="dxa"/>
+              <w:left w:w="95" w:type="dxa"/>
+              <w:bottom w:w="95" w:type="dxa"/>
+              <w:right w:w="95" w:type="dxa"/>
+            </w:tcMar>
+          </w:tcPr>
+          <w:p>
+            <w:pPr>
+              <w:spacing w:after="60" w:before="60"/>
+            </w:pPr>
+            <w:r>
+              <w:rPr>
+                <w:b w:val="0"/>
+                <w:sz w:val="20"/>
+              </w:rPr>
+              <w:t>物料检索 Top 5 命中</w:t>
+            </w:r>
+          </w:p>
+        </w:tc>
+        <w:tc>
+          <w:tcPr>
+            <w:tcW w:type="dxa" w:w="2551"/>
+            <w:vAlign w:val="center"/>
+            <w:tcMar>
+              <w:top w:w="95" w:type="dxa"/>
+              <w:left w:w="95" w:type="dxa"/>
+              <w:bottom w:w="95" w:type="dxa"/>
+              <w:right w:w="95" w:type="dxa"/>
+            </w:tcMar>
+          </w:tcPr>
+          <w:p>
+            <w:pPr>
+              <w:spacing w:after="60" w:before="60"/>
+              <w:jc w:val="center"/>
+            </w:pPr>
+            <w:r>
+              <w:rPr>
+                <w:b w:val="0"/>
+                <w:sz w:val="20"/>
+              </w:rPr>
+              <w:t>9/9</w:t>
+            </w:r>
+          </w:p>
+        </w:tc>
+        <w:tc>
+          <w:tcPr>
+            <w:tcW w:type="dxa" w:w="4082"/>
+            <w:vAlign w:val="center"/>
+            <w:tcMar>
+              <w:top w:w="95" w:type="dxa"/>
+              <w:left w:w="95" w:type="dxa"/>
+              <w:bottom w:w="95" w:type="dxa"/>
+              <w:right w:w="95" w:type="dxa"/>
+            </w:tcMar>
+          </w:tcPr>
+          <w:p>
+            <w:pPr>
+              <w:spacing w:after="60" w:before="60"/>
+            </w:pPr>
+            <w:r>
+              <w:rPr>
+                <w:b w:val="0"/>
+                <w:sz w:val="20"/>
+              </w:rPr>
+              <w:t>9 个含检索标签的案例 包含歧义候选</w:t>
+            </w:r>
+          </w:p>
+        </w:tc>
+      </w:tr>
+      <w:tr>
+        <w:trPr>
+          <w:cantSplit/>
+        </w:trPr>
+        <w:tc>
+          <w:tcPr>
+            <w:tcW w:type="dxa" w:w="3005"/>
+            <w:vAlign w:val="center"/>
+            <w:tcMar>
+              <w:top w:w="95" w:type="dxa"/>
+              <w:left w:w="95" w:type="dxa"/>
+              <w:bottom w:w="95" w:type="dxa"/>
+              <w:right w:w="95" w:type="dxa"/>
+            </w:tcMar>
+          </w:tcPr>
+          <w:p>
+            <w:pPr>
+              <w:spacing w:after="60" w:before="60"/>
+            </w:pPr>
+            <w:r>
+              <w:rPr>
+                <w:b w:val="0"/>
+                <w:sz w:val="20"/>
+              </w:rPr>
+              <w:t>物料身份归因一致</w:t>
+            </w:r>
+          </w:p>
+        </w:tc>
+        <w:tc>
+          <w:tcPr>
+            <w:tcW w:type="dxa" w:w="2551"/>
+            <w:vAlign w:val="center"/>
+            <w:tcMar>
+              <w:top w:w="95" w:type="dxa"/>
+              <w:left w:w="95" w:type="dxa"/>
+              <w:bottom w:w="95" w:type="dxa"/>
+              <w:right w:w="95" w:type="dxa"/>
+            </w:tcMar>
+          </w:tcPr>
+          <w:p>
+            <w:pPr>
+              <w:spacing w:after="60" w:before="60"/>
+              <w:jc w:val="center"/>
+            </w:pPr>
+            <w:r>
+              <w:rPr>
+                <w:b w:val="0"/>
+                <w:sz w:val="20"/>
+              </w:rPr>
+              <w:t>9/9</w:t>
+            </w:r>
+          </w:p>
+        </w:tc>
+        <w:tc>
+          <w:tcPr>
+            <w:tcW w:type="dxa" w:w="4082"/>
+            <w:vAlign w:val="center"/>
+            <w:tcMar>
+              <w:top w:w="95" w:type="dxa"/>
+              <w:left w:w="95" w:type="dxa"/>
+              <w:bottom w:w="95" w:type="dxa"/>
+              <w:right w:w="95" w:type="dxa"/>
+            </w:tcMar>
+          </w:tcPr>
+          <w:p>
+            <w:pPr>
+              <w:spacing w:after="60" w:before="60"/>
+            </w:pPr>
+            <w:r>
+              <w:rPr>
+                <w:b w:val="0"/>
+                <w:sz w:val="20"/>
+              </w:rPr>
+              <w:t>9 个含归因标签的案例 不评价解释质量</w:t>
+            </w:r>
+          </w:p>
+        </w:tc>
+      </w:tr>
+      <w:tr>
+        <w:trPr>
+          <w:cantSplit/>
+        </w:trPr>
+        <w:tc>
+          <w:tcPr>
+            <w:tcW w:type="dxa" w:w="3005"/>
+            <w:vAlign w:val="center"/>
+            <w:tcMar>
+              <w:top w:w="95" w:type="dxa"/>
+              <w:left w:w="95" w:type="dxa"/>
+              <w:bottom w:w="95" w:type="dxa"/>
+              <w:right w:w="95" w:type="dxa"/>
+            </w:tcMar>
+          </w:tcPr>
+          <w:p>
+            <w:pPr>
+              <w:spacing w:after="60" w:before="60"/>
+            </w:pPr>
+            <w:r>
+              <w:rPr>
+                <w:b w:val="0"/>
+                <w:sz w:val="20"/>
+              </w:rPr>
+              <w:t>成功工具序列位置匹配</w:t>
+            </w:r>
+          </w:p>
+        </w:tc>
+        <w:tc>
+          <w:tcPr>
+            <w:tcW w:type="dxa" w:w="2551"/>
+            <w:vAlign w:val="center"/>
+            <w:tcMar>
+              <w:top w:w="95" w:type="dxa"/>
+              <w:left w:w="95" w:type="dxa"/>
+              <w:bottom w:w="95" w:type="dxa"/>
+              <w:right w:w="95" w:type="dxa"/>
+            </w:tcMar>
+          </w:tcPr>
+          <w:p>
+            <w:pPr>
+              <w:spacing w:after="60" w:before="60"/>
+              <w:jc w:val="center"/>
+            </w:pPr>
+            <w:r>
+              <w:rPr>
+                <w:b w:val="0"/>
+                <w:sz w:val="20"/>
+              </w:rPr>
+              <w:t>78/78</w:t>
+            </w:r>
+          </w:p>
+        </w:tc>
+        <w:tc>
+          <w:tcPr>
+            <w:tcW w:type="dxa" w:w="4082"/>
+            <w:vAlign w:val="center"/>
+            <w:tcMar>
+              <w:top w:w="95" w:type="dxa"/>
+              <w:left w:w="95" w:type="dxa"/>
+              <w:bottom w:w="95" w:type="dxa"/>
+              <w:right w:w="95" w:type="dxa"/>
+            </w:tcMar>
+          </w:tcPr>
+          <w:p>
+            <w:pPr>
+              <w:spacing w:after="60" w:before="60"/>
+            </w:pPr>
+            <w:r>
+              <w:rPr>
+                <w:b w:val="0"/>
+                <w:sz w:val="20"/>
+              </w:rPr>
+              <w:t>10 个案例的成功工具结果与独立标注逐位置比较</w:t>
+            </w:r>
+          </w:p>
+        </w:tc>
+      </w:tr>
+      <w:tr>
+        <w:trPr>
+          <w:cantSplit/>
+        </w:trPr>
+        <w:tc>
+          <w:tcPr>
+            <w:tcW w:type="dxa" w:w="3005"/>
+            <w:vAlign w:val="center"/>
+            <w:tcMar>
+              <w:top w:w="95" w:type="dxa"/>
+              <w:left w:w="95" w:type="dxa"/>
+              <w:bottom w:w="95" w:type="dxa"/>
+              <w:right w:w="95" w:type="dxa"/>
+            </w:tcMar>
+          </w:tcPr>
+          <w:p>
+            <w:pPr>
+              <w:spacing w:after="60" w:before="60"/>
+            </w:pPr>
+            <w:r>
+              <w:rPr>
+                <w:b w:val="0"/>
+                <w:sz w:val="20"/>
+              </w:rPr>
+              <w:t>未经授权的模拟写入</w:t>
+            </w:r>
+          </w:p>
+        </w:tc>
+        <w:tc>
+          <w:tcPr>
+            <w:tcW w:type="dxa" w:w="2551"/>
+            <w:vAlign w:val="center"/>
+            <w:tcMar>
+              <w:top w:w="95" w:type="dxa"/>
+              <w:left w:w="95" w:type="dxa"/>
+              <w:bottom w:w="95" w:type="dxa"/>
+              <w:right w:w="95" w:type="dxa"/>
+            </w:tcMar>
+          </w:tcPr>
+          <w:p>
+            <w:pPr>
+              <w:spacing w:after="60" w:before="60"/>
+              <w:jc w:val="center"/>
+            </w:pPr>
+            <w:r>
+              <w:rPr>
+                <w:b w:val="0"/>
+                <w:sz w:val="20"/>
+              </w:rPr>
+              <w:t>0</w:t>
+            </w:r>
+          </w:p>
+        </w:tc>
+        <w:tc>
+          <w:tcPr>
+            <w:tcW w:type="dxa" w:w="4082"/>
+            <w:vAlign w:val="center"/>
+            <w:tcMar>
+              <w:top w:w="95" w:type="dxa"/>
+              <w:left w:w="95" w:type="dxa"/>
+              <w:bottom w:w="95" w:type="dxa"/>
+              <w:right w:w="95" w:type="dxa"/>
+            </w:tcMar>
+          </w:tcPr>
+          <w:p>
+            <w:pPr>
+              <w:spacing w:after="60" w:before="60"/>
+            </w:pPr>
+            <w:r>
+              <w:rPr>
+                <w:b w:val="0"/>
+                <w:sz w:val="20"/>
+              </w:rPr>
+              <w:t>10 个案例 检查审批前写入及包含越权探测</w:t>
+            </w:r>
+          </w:p>
+        </w:tc>
+      </w:tr>
+      <w:tr>
+        <w:trPr>
+          <w:cantSplit/>
+        </w:trPr>
+        <w:tc>
+          <w:tcPr>
+            <w:tcW w:type="dxa" w:w="3005"/>
+            <w:vAlign w:val="center"/>
+            <w:tcMar>
+              <w:top w:w="95" w:type="dxa"/>
+              <w:left w:w="95" w:type="dxa"/>
+              <w:bottom w:w="95" w:type="dxa"/>
+              <w:right w:w="95" w:type="dxa"/>
+            </w:tcMar>
+          </w:tcPr>
+          <w:p>
+            <w:pPr>
+              <w:spacing w:after="60" w:before="60"/>
+            </w:pPr>
+            <w:r>
+              <w:rPr>
+                <w:b w:val="0"/>
+                <w:sz w:val="20"/>
+              </w:rPr>
+              <w:t>恢复案例通过</w:t>
+            </w:r>
+          </w:p>
+        </w:tc>
+        <w:tc>
+          <w:tcPr>
+            <w:tcW w:type="dxa" w:w="2551"/>
+            <w:vAlign w:val="center"/>
+            <w:tcMar>
+              <w:top w:w="95" w:type="dxa"/>
+              <w:left w:w="95" w:type="dxa"/>
+              <w:bottom w:w="95" w:type="dxa"/>
+              <w:right w:w="95" w:type="dxa"/>
+            </w:tcMar>
+          </w:tcPr>
+          <w:p>
+            <w:pPr>
+              <w:spacing w:after="60" w:before="60"/>
+              <w:jc w:val="center"/>
+            </w:pPr>
+            <w:r>
+              <w:rPr>
+                <w:b w:val="0"/>
+                <w:sz w:val="20"/>
+              </w:rPr>
+              <w:t>2/2</w:t>
+            </w:r>
+          </w:p>
+        </w:tc>
+        <w:tc>
+          <w:tcPr>
+            <w:tcW w:type="dxa" w:w="4082"/>
+            <w:vAlign w:val="center"/>
+            <w:tcMar>
+              <w:top w:w="95" w:type="dxa"/>
+              <w:left w:w="95" w:type="dxa"/>
+              <w:bottom w:w="95" w:type="dxa"/>
+              <w:right w:w="95" w:type="dxa"/>
+            </w:tcMar>
+          </w:tcPr>
+          <w:p>
+            <w:pPr>
+              <w:spacing w:after="60" w:before="60"/>
+            </w:pPr>
+            <w:r>
+              <w:rPr>
+                <w:b w:val="0"/>
+                <w:sz w:val="20"/>
+              </w:rPr>
+              <w:t>重启与重复恢复 写后 checkpoint 中断且模型不可用</w:t>
+            </w:r>
+          </w:p>
+        </w:tc>
+      </w:tr>
+      <w:tr>
+        <w:trPr>
+          <w:cantSplit/>
+        </w:trPr>
+        <w:tc>
+          <w:tcPr>
+            <w:tcW w:type="dxa" w:w="3005"/>
+            <w:vAlign w:val="center"/>
+            <w:tcMar>
+              <w:top w:w="95" w:type="dxa"/>
+              <w:left w:w="95" w:type="dxa"/>
+              <w:bottom w:w="95" w:type="dxa"/>
+              <w:right w:w="95" w:type="dxa"/>
+            </w:tcMar>
+          </w:tcPr>
+          <w:p>
+            <w:pPr>
+              <w:spacing w:after="60" w:before="60"/>
+            </w:pPr>
+            <w:r>
+              <w:rPr>
+                <w:b w:val="0"/>
+                <w:sz w:val="20"/>
+              </w:rPr>
+              <w:t>恢复案例最终写入数</w:t>
+            </w:r>
+          </w:p>
+        </w:tc>
+        <w:tc>
+          <w:tcPr>
+            <w:tcW w:type="dxa" w:w="2551"/>
+            <w:vAlign w:val="center"/>
+            <w:tcMar>
+              <w:top w:w="95" w:type="dxa"/>
+              <w:left w:w="95" w:type="dxa"/>
+              <w:bottom w:w="95" w:type="dxa"/>
+              <w:right w:w="95" w:type="dxa"/>
+            </w:tcMar>
+          </w:tcPr>
+          <w:p>
+            <w:pPr>
+              <w:spacing w:after="60" w:before="60"/>
+              <w:jc w:val="center"/>
+            </w:pPr>
+            <w:r>
+              <w:rPr>
+                <w:b w:val="0"/>
+                <w:sz w:val="20"/>
+              </w:rPr>
+              <w:t>每例 1 笔</w:t>
+            </w:r>
+          </w:p>
+        </w:tc>
+        <w:tc>
+          <w:tcPr>
+            <w:tcW w:type="dxa" w:w="4082"/>
+            <w:vAlign w:val="center"/>
+            <w:tcMar>
+              <w:top w:w="95" w:type="dxa"/>
+              <w:left w:w="95" w:type="dxa"/>
+              <w:bottom w:w="95" w:type="dxa"/>
+              <w:right w:w="95" w:type="dxa"/>
+            </w:tcMar>
+          </w:tcPr>
+          <w:p>
+            <w:pPr>
+              <w:spacing w:after="60" w:before="60"/>
+            </w:pPr>
+            <w:r>
+              <w:rPr>
+                <w:b w:val="0"/>
+                <w:sz w:val="20"/>
+              </w:rPr>
+              <w:t>两个案例均恢复完成 重复运行未新增写入</w:t>
+            </w:r>
+          </w:p>
+        </w:tc>
+      </w:tr>
+    </w:tbl>
+    <w:p>
+      <w:pPr>
+        <w:spacing w:after="20"/>
+      </w:pPr>
+    </w:p>
+    <w:p>
+      <w:pPr/>
+      <w:r>
+        <w:t>检索与归因各有 9 个标签案例，两组样本不完全相同：新物料录入没有既有物料检索标签，未澄清的歧义案例没有唯一归因标签。工具序列按成功工具结果计分；被拦截或失败的调用另进入审计，不计为成功工具选择。恢复故障为受控注入，不代表生产断电或分布式压力验证。</w:t>
       </w:r>
     </w:p>
     <w:p>

</xml_diff>

<commit_message>
docs: simplify project highlights and remove quantitative claims
</commit_message>
<xml_diff>
--- a/docs/business-project-brief.docx
+++ b/docs/business-project-brief.docx
@@ -49,25 +49,7 @@
         <w:t>对齐多源物料证据：</w:t>
       </w:r>
       <w:r>
-        <w:t xml:space="preserve"> 针对同物异名与物料、库存、订单口径分散的问题，为建立可复查的采购依据，通过 MCP Tool 与固定 CLI JSON 合约统一读取，校验物料标识、规格和单位，歧义时请求补充信息；离线检索标签案例 Top 5 命中 </w:t>
-      </w:r>
-      <w:r>
-        <w:rPr>
-          <w:b/>
-        </w:rPr>
-        <w:t>9/9</w:t>
-      </w:r>
-      <w:r>
-        <w:t xml:space="preserve">，归因标签案例物料身份一致 </w:t>
-      </w:r>
-      <w:r>
-        <w:rPr>
-          <w:b/>
-        </w:rPr>
-        <w:t>9/9</w:t>
-      </w:r>
-      <w:r>
-        <w:t>。</w:t>
+        <w:t xml:space="preserve"> 面向同物异名与跨系统口径不一致，通过 MCP/CLI 统一读取并校验物料、库存和采购记录；歧义时请求补充信息，让采购判断有据可查。</w:t>
       </w:r>
     </w:p>
     <w:p>
@@ -81,25 +63,7 @@
         <w:t>约束推理与上下文：</w:t>
       </w:r>
       <w:r>
-        <w:t xml:space="preserve"> 针对长流程中历史信息干扰和工具越阶段调用的风险，为保留任务约束并按业务顺序核查，将物料发现至提案组织为显式阶段，结合 pi Runtime 限定工具，以五层上下文压缩轨迹并保留原始证据；</w:t>
-      </w:r>
-      <w:r>
-        <w:rPr>
-          <w:b/>
-        </w:rPr>
-        <w:t>10 个</w:t>
-      </w:r>
-      <w:r>
-        <w:t xml:space="preserve">离线案例的成功工具序列位置匹配 </w:t>
-      </w:r>
-      <w:r>
-        <w:rPr>
-          <w:b/>
-        </w:rPr>
-        <w:t>78/78</w:t>
-      </w:r>
-      <w:r>
-        <w:t>。</w:t>
+        <w:t xml:space="preserve"> 将物料核查与提案组织为显式阶段，按阶段限定 pi 工具；分层保留任务、证据和策略，压缩历史轨迹，减少过时信息对判断的干扰。</w:t>
       </w:r>
     </w:p>
     <w:p>
@@ -110,46 +74,10 @@
         <w:rPr>
           <w:b/>
         </w:rPr>
-        <w:t>量化重复采购风险：</w:t>
+        <w:t>识别重复采购风险：</w:t>
       </w:r>
       <w:r>
-        <w:t xml:space="preserve"> 针对冻结库存、已完成订单误计入供应导致采购量失真的问题，为辅助复核采购需求，按库存与订单状态核算有效供应，以确定性规则计算缺口、建议量和金额；轴承合成案例中建议采购 </w:t>
-      </w:r>
-      <w:r>
-        <w:rPr>
-          <w:b/>
-        </w:rPr>
-        <w:t>10 个</w:t>
-      </w:r>
-      <w:r>
-        <w:t xml:space="preserve">，识别申请 </w:t>
-      </w:r>
-      <w:r>
-        <w:rPr>
-          <w:b/>
-        </w:rPr>
-        <w:t>15 个</w:t>
-      </w:r>
-      <w:r>
-        <w:t xml:space="preserve">中的 </w:t>
-      </w:r>
-      <w:r>
-        <w:rPr>
-          <w:b/>
-        </w:rPr>
-        <w:t>5 个</w:t>
-      </w:r>
-      <w:r>
-        <w:t xml:space="preserve">超额量及 </w:t>
-      </w:r>
-      <w:r>
-        <w:rPr>
-          <w:b/>
-        </w:rPr>
-        <w:t>62.50 元</w:t>
-      </w:r>
-      <w:r>
-        <w:t>对应金额，供人工审阅。</w:t>
+        <w:t xml:space="preserve"> 针对库存和订单状态混用，按有效库存与已确认在途核算供应，结合需求测算采购缺口、建议量和金额，为人工复核提供依据。</w:t>
       </w:r>
     </w:p>
     <w:p>
@@ -163,25 +91,7 @@
         <w:t>守住执行与审批边界：</w:t>
       </w:r>
       <w:r>
-        <w:t xml:space="preserve"> 针对模型直接写入、跨会话越权和旧批准复用的风险，为确保每笔动作有明确授权，在 PreToolUse 校验身份、阶段、证据及风险，将批准绑定提案版本、参数摘要与幂等键后执行；</w:t>
-      </w:r>
-      <w:r>
-        <w:rPr>
-          <w:b/>
-        </w:rPr>
-        <w:t>10 个</w:t>
-      </w:r>
-      <w:r>
-        <w:t xml:space="preserve">合成案例中未经授权的模拟 ERP 写入为 </w:t>
-      </w:r>
-      <w:r>
-        <w:rPr>
-          <w:b/>
-        </w:rPr>
-        <w:t>0</w:t>
-      </w:r>
-      <w:r>
-        <w:t>，待审批与拒绝场景均无写入。</w:t>
+        <w:t xml:space="preserve"> 在 PreToolUse 校验身份、阶段与风险，将高风险动作转为提案，并绑定版本、参数和幂等键审批，防止越权写入与旧批准复用。</w:t>
       </w:r>
     </w:p>
     <w:p>
@@ -195,31 +105,7 @@
         <w:t>闭合恢复与结果验证：</w:t>
       </w:r>
       <w:r>
-        <w:t xml:space="preserve"> 针对审批跨运行及写入后中断容易重复建单的问题，为恢复进度并确认实际落地结果，以 SQLite 保存 checkpoint 与审批，结合租约、版本校验及 ERP 幂等查询恢复，再核对批准内容；</w:t>
-      </w:r>
-      <w:r>
-        <w:rPr>
-          <w:b/>
-        </w:rPr>
-        <w:t>2 个</w:t>
-      </w:r>
-      <w:r>
-        <w:t xml:space="preserve">恢复案例全部通过，重复恢复各保持 </w:t>
-      </w:r>
-      <w:r>
-        <w:rPr>
-          <w:b/>
-        </w:rPr>
-        <w:t>1 笔</w:t>
-      </w:r>
-      <w:r>
-        <w:t>写入，其中包含写后 checkpoint 中断且模型不可用场景。</w:t>
-      </w:r>
-    </w:p>
-    <w:p>
-      <w:pPr/>
-      <w:r>
-        <w:t>以上量化结果来自合成数据离线评测或示例测算，样本口径见第六节。采购金额为超额申请对应金额；真实模型质量、实际降本及工时收益尚未验证。</w:t>
+        <w:t xml:space="preserve"> 针对审批等待与执行中断，以 SQLite 保存进度并查询 ERP 幂等结果，恢复时核对授权、执行后核验落地内容，避免重复建单。</w:t>
       </w:r>
     </w:p>
     <w:p>
@@ -404,13 +290,13 @@
     <w:p>
       <w:pPr/>
       <w:r>
-        <w:t>长流程中的历史对话和重复工具结果容易占满上下文，也可能让当前任务被过时信息干扰。项目将 ContextPack 分为任务、证据引用、工具轨迹、状态和策略五层，按当前阶段提供结构化输入。</w:t>
+        <w:t>长流程中的历史对话和重复工具结果容易占满上下文，也可能让当前任务被过时信息干扰。项目将 ContextPack 按任务、证据引用、工具轨迹、状态和策略分层，按当前阶段提供结构化输入。</w:t>
       </w:r>
     </w:p>
     <w:p>
       <w:pPr/>
       <w:r>
-        <w:t>近期证据引用最多保留 32 个，单条事实摘要最多 1000 字符，事实包按 24000 字符预算削减；较早工具轨迹压缩为摘要和近期记录。原始工具结果完整保存在 SQLite，截断摘要明确标记，任务与策略不由普通历史摘要覆盖。外部返回文本作为数据处理，不能替代工具权限或业务规则。</w:t>
+        <w:t>上下文为证据引用、事实摘要和历史轨迹设置预算，优先保留近期信息，较早轨迹压缩为摘要。原始工具结果完整保存在 SQLite，截断摘要明确标记，任务与策略不由普通历史摘要覆盖。外部返回文本作为数据处理，不能替代工具权限或业务规则。</w:t>
       </w:r>
     </w:p>
     <w:p>
@@ -533,595 +419,19 @@
     <w:p>
       <w:pPr/>
       <w:r>
-        <w:t>业务人员申请采购 BRG-6204 轴承 15 个，用于满足需求 20 个并维持安全库存 3 个。证据显示可用库存 8 个、已确认在途 5 个，另有冻结库存 99 个、报废库存 20 个及历史已完成采购 100 个。</w:t>
-      </w:r>
-    </w:p>
-    <w:tbl>
-      <w:tblPr>
-        <w:tblStyle w:val="TableGrid"/>
-        <w:tblW w:type="auto" w:w="0"/>
-        <w:tblLayout w:type="fixed"/>
-        <w:tblLook w:firstColumn="1" w:firstRow="1" w:lastColumn="0" w:lastRow="0" w:noHBand="0" w:noVBand="1" w:val="04A0"/>
-        <w:tblBorders>
-          <w:top w:val="single" w:sz="4" w:color="D9D9D9"/>
-          <w:left w:val="single" w:sz="4" w:color="D9D9D9"/>
-          <w:bottom w:val="single" w:sz="4" w:color="D9D9D9"/>
-          <w:right w:val="single" w:sz="4" w:color="D9D9D9"/>
-          <w:insideH w:val="single" w:sz="4" w:color="D9D9D9"/>
-          <w:insideV w:val="single" w:sz="4" w:color="D9D9D9"/>
-        </w:tblBorders>
-      </w:tblPr>
-      <w:tblGrid>
-        <w:gridCol w:w="3005"/>
-        <w:gridCol w:w="2551"/>
-        <w:gridCol w:w="4082"/>
-      </w:tblGrid>
-      <w:tr>
-        <w:trPr>
-          <w:cantSplit/>
-          <w:tblHeader/>
-        </w:trPr>
-        <w:tc>
-          <w:tcPr>
-            <w:tcW w:type="dxa" w:w="3005"/>
-            <w:vAlign w:val="center"/>
-            <w:tcMar>
-              <w:top w:w="95" w:type="dxa"/>
-              <w:left w:w="95" w:type="dxa"/>
-              <w:bottom w:w="95" w:type="dxa"/>
-              <w:right w:w="95" w:type="dxa"/>
-            </w:tcMar>
-            <w:shd w:fill="E9ECEF"/>
-          </w:tcPr>
-          <w:p>
-            <w:pPr>
-              <w:spacing w:after="60" w:before="60"/>
-            </w:pPr>
-            <w:r>
-              <w:rPr>
-                <w:b/>
-                <w:sz w:val="20"/>
-              </w:rPr>
-              <w:t>审阅项目</w:t>
-            </w:r>
-          </w:p>
-        </w:tc>
-        <w:tc>
-          <w:tcPr>
-            <w:tcW w:type="dxa" w:w="2551"/>
-            <w:vAlign w:val="center"/>
-            <w:tcMar>
-              <w:top w:w="95" w:type="dxa"/>
-              <w:left w:w="95" w:type="dxa"/>
-              <w:bottom w:w="95" w:type="dxa"/>
-              <w:right w:w="95" w:type="dxa"/>
-            </w:tcMar>
-            <w:shd w:fill="E9ECEF"/>
-          </w:tcPr>
-          <w:p>
-            <w:pPr>
-              <w:spacing w:after="60" w:before="60"/>
-              <w:jc w:val="center"/>
-            </w:pPr>
-            <w:r>
-              <w:rPr>
-                <w:b/>
-                <w:sz w:val="20"/>
-              </w:rPr>
-              <w:t>结果</w:t>
-            </w:r>
-          </w:p>
-        </w:tc>
-        <w:tc>
-          <w:tcPr>
-            <w:tcW w:type="dxa" w:w="4082"/>
-            <w:vAlign w:val="center"/>
-            <w:tcMar>
-              <w:top w:w="95" w:type="dxa"/>
-              <w:left w:w="95" w:type="dxa"/>
-              <w:bottom w:w="95" w:type="dxa"/>
-              <w:right w:w="95" w:type="dxa"/>
-            </w:tcMar>
-            <w:shd w:fill="E9ECEF"/>
-          </w:tcPr>
-          <w:p>
-            <w:pPr>
-              <w:spacing w:after="60" w:before="60"/>
-            </w:pPr>
-            <w:r>
-              <w:rPr>
-                <w:b/>
-                <w:sz w:val="20"/>
-              </w:rPr>
-              <w:t>依据</w:t>
-            </w:r>
-          </w:p>
-        </w:tc>
-      </w:tr>
-      <w:tr>
-        <w:trPr>
-          <w:cantSplit/>
-        </w:trPr>
-        <w:tc>
-          <w:tcPr>
-            <w:tcW w:type="dxa" w:w="3005"/>
-            <w:vAlign w:val="center"/>
-            <w:tcMar>
-              <w:top w:w="95" w:type="dxa"/>
-              <w:left w:w="95" w:type="dxa"/>
-              <w:bottom w:w="95" w:type="dxa"/>
-              <w:right w:w="95" w:type="dxa"/>
-            </w:tcMar>
-          </w:tcPr>
-          <w:p>
-            <w:pPr>
-              <w:spacing w:after="60" w:before="60"/>
-            </w:pPr>
-            <w:r>
-              <w:rPr>
-                <w:b w:val="0"/>
-                <w:sz w:val="20"/>
-              </w:rPr>
-              <w:t>可计入供应</w:t>
-            </w:r>
-          </w:p>
-        </w:tc>
-        <w:tc>
-          <w:tcPr>
-            <w:tcW w:type="dxa" w:w="2551"/>
-            <w:vAlign w:val="center"/>
-            <w:tcMar>
-              <w:top w:w="95" w:type="dxa"/>
-              <w:left w:w="95" w:type="dxa"/>
-              <w:bottom w:w="95" w:type="dxa"/>
-              <w:right w:w="95" w:type="dxa"/>
-            </w:tcMar>
-          </w:tcPr>
-          <w:p>
-            <w:pPr>
-              <w:spacing w:after="60" w:before="60"/>
-              <w:jc w:val="center"/>
-            </w:pPr>
-            <w:r>
-              <w:rPr>
-                <w:b w:val="0"/>
-                <w:sz w:val="20"/>
-              </w:rPr>
-              <w:t>库存 8 个 在途 5 个</w:t>
-            </w:r>
-          </w:p>
-        </w:tc>
-        <w:tc>
-          <w:tcPr>
-            <w:tcW w:type="dxa" w:w="4082"/>
-            <w:vAlign w:val="center"/>
-            <w:tcMar>
-              <w:top w:w="95" w:type="dxa"/>
-              <w:left w:w="95" w:type="dxa"/>
-              <w:bottom w:w="95" w:type="dxa"/>
-              <w:right w:w="95" w:type="dxa"/>
-            </w:tcMar>
-          </w:tcPr>
-          <w:p>
-            <w:pPr>
-              <w:spacing w:after="60" w:before="60"/>
-            </w:pPr>
-            <w:r>
-              <w:rPr>
-                <w:b w:val="0"/>
-                <w:sz w:val="20"/>
-              </w:rPr>
-              <w:t>可用库存扣预留 在途扣已收货</w:t>
-            </w:r>
-          </w:p>
-        </w:tc>
-      </w:tr>
-      <w:tr>
-        <w:trPr>
-          <w:cantSplit/>
-        </w:trPr>
-        <w:tc>
-          <w:tcPr>
-            <w:tcW w:type="dxa" w:w="3005"/>
-            <w:vAlign w:val="center"/>
-            <w:tcMar>
-              <w:top w:w="95" w:type="dxa"/>
-              <w:left w:w="95" w:type="dxa"/>
-              <w:bottom w:w="95" w:type="dxa"/>
-              <w:right w:w="95" w:type="dxa"/>
-            </w:tcMar>
-          </w:tcPr>
-          <w:p>
-            <w:pPr>
-              <w:spacing w:after="60" w:before="60"/>
-            </w:pPr>
-            <w:r>
-              <w:rPr>
-                <w:b w:val="0"/>
-                <w:sz w:val="20"/>
-              </w:rPr>
-              <w:t>建议采购量</w:t>
-            </w:r>
-          </w:p>
-        </w:tc>
-        <w:tc>
-          <w:tcPr>
-            <w:tcW w:type="dxa" w:w="2551"/>
-            <w:vAlign w:val="center"/>
-            <w:tcMar>
-              <w:top w:w="95" w:type="dxa"/>
-              <w:left w:w="95" w:type="dxa"/>
-              <w:bottom w:w="95" w:type="dxa"/>
-              <w:right w:w="95" w:type="dxa"/>
-            </w:tcMar>
-          </w:tcPr>
-          <w:p>
-            <w:pPr>
-              <w:spacing w:after="60" w:before="60"/>
-              <w:jc w:val="center"/>
-            </w:pPr>
-            <w:r>
-              <w:rPr>
-                <w:b w:val="0"/>
-                <w:sz w:val="20"/>
-              </w:rPr>
-              <w:t>10 个</w:t>
-            </w:r>
-          </w:p>
-        </w:tc>
-        <w:tc>
-          <w:tcPr>
-            <w:tcW w:type="dxa" w:w="4082"/>
-            <w:vAlign w:val="center"/>
-            <w:tcMar>
-              <w:top w:w="95" w:type="dxa"/>
-              <w:left w:w="95" w:type="dxa"/>
-              <w:bottom w:w="95" w:type="dxa"/>
-              <w:right w:w="95" w:type="dxa"/>
-            </w:tcMar>
-          </w:tcPr>
-          <w:p>
-            <w:pPr>
-              <w:spacing w:after="60" w:before="60"/>
-            </w:pPr>
-            <w:r>
-              <w:rPr>
-                <w:b w:val="0"/>
-                <w:sz w:val="20"/>
-              </w:rPr>
-              <w:t>max(0，20 + 3 − 8 − 5)</w:t>
-            </w:r>
-          </w:p>
-        </w:tc>
-      </w:tr>
-      <w:tr>
-        <w:trPr>
-          <w:cantSplit/>
-        </w:trPr>
-        <w:tc>
-          <w:tcPr>
-            <w:tcW w:type="dxa" w:w="3005"/>
-            <w:vAlign w:val="center"/>
-            <w:tcMar>
-              <w:top w:w="95" w:type="dxa"/>
-              <w:left w:w="95" w:type="dxa"/>
-              <w:bottom w:w="95" w:type="dxa"/>
-              <w:right w:w="95" w:type="dxa"/>
-            </w:tcMar>
-          </w:tcPr>
-          <w:p>
-            <w:pPr>
-              <w:spacing w:after="60" w:before="60"/>
-            </w:pPr>
-            <w:r>
-              <w:rPr>
-                <w:b w:val="0"/>
-                <w:sz w:val="20"/>
-              </w:rPr>
-              <w:t>本次申请后的预计库存</w:t>
-            </w:r>
-          </w:p>
-        </w:tc>
-        <w:tc>
-          <w:tcPr>
-            <w:tcW w:type="dxa" w:w="2551"/>
-            <w:vAlign w:val="center"/>
-            <w:tcMar>
-              <w:top w:w="95" w:type="dxa"/>
-              <w:left w:w="95" w:type="dxa"/>
-              <w:bottom w:w="95" w:type="dxa"/>
-              <w:right w:w="95" w:type="dxa"/>
-            </w:tcMar>
-          </w:tcPr>
-          <w:p>
-            <w:pPr>
-              <w:spacing w:after="60" w:before="60"/>
-              <w:jc w:val="center"/>
-            </w:pPr>
-            <w:r>
-              <w:rPr>
-                <w:b w:val="0"/>
-                <w:sz w:val="20"/>
-              </w:rPr>
-              <w:t>8 个</w:t>
-            </w:r>
-          </w:p>
-        </w:tc>
-        <w:tc>
-          <w:tcPr>
-            <w:tcW w:type="dxa" w:w="4082"/>
-            <w:vAlign w:val="center"/>
-            <w:tcMar>
-              <w:top w:w="95" w:type="dxa"/>
-              <w:left w:w="95" w:type="dxa"/>
-              <w:bottom w:w="95" w:type="dxa"/>
-              <w:right w:w="95" w:type="dxa"/>
-            </w:tcMar>
-          </w:tcPr>
-          <w:p>
-            <w:pPr>
-              <w:spacing w:after="60" w:before="60"/>
-            </w:pPr>
-            <w:r>
-              <w:rPr>
-                <w:b w:val="0"/>
-                <w:sz w:val="20"/>
-              </w:rPr>
-              <w:t>8 + 5 + 15 − 20</w:t>
-            </w:r>
-          </w:p>
-        </w:tc>
-      </w:tr>
-      <w:tr>
-        <w:trPr>
-          <w:cantSplit/>
-        </w:trPr>
-        <w:tc>
-          <w:tcPr>
-            <w:tcW w:type="dxa" w:w="3005"/>
-            <w:vAlign w:val="center"/>
-            <w:tcMar>
-              <w:top w:w="95" w:type="dxa"/>
-              <w:left w:w="95" w:type="dxa"/>
-              <w:bottom w:w="95" w:type="dxa"/>
-              <w:right w:w="95" w:type="dxa"/>
-            </w:tcMar>
-          </w:tcPr>
-          <w:p>
-            <w:pPr>
-              <w:spacing w:after="60" w:before="60"/>
-            </w:pPr>
-            <w:r>
-              <w:rPr>
-                <w:b w:val="0"/>
-                <w:sz w:val="20"/>
-              </w:rPr>
-              <w:t>超额申请量</w:t>
-            </w:r>
-          </w:p>
-        </w:tc>
-        <w:tc>
-          <w:tcPr>
-            <w:tcW w:type="dxa" w:w="2551"/>
-            <w:vAlign w:val="center"/>
-            <w:tcMar>
-              <w:top w:w="95" w:type="dxa"/>
-              <w:left w:w="95" w:type="dxa"/>
-              <w:bottom w:w="95" w:type="dxa"/>
-              <w:right w:w="95" w:type="dxa"/>
-            </w:tcMar>
-          </w:tcPr>
-          <w:p>
-            <w:pPr>
-              <w:spacing w:after="60" w:before="60"/>
-              <w:jc w:val="center"/>
-            </w:pPr>
-            <w:r>
-              <w:rPr>
-                <w:b w:val="0"/>
-                <w:sz w:val="20"/>
-              </w:rPr>
-              <w:t>5 个</w:t>
-            </w:r>
-          </w:p>
-        </w:tc>
-        <w:tc>
-          <w:tcPr>
-            <w:tcW w:type="dxa" w:w="4082"/>
-            <w:vAlign w:val="center"/>
-            <w:tcMar>
-              <w:top w:w="95" w:type="dxa"/>
-              <w:left w:w="95" w:type="dxa"/>
-              <w:bottom w:w="95" w:type="dxa"/>
-              <w:right w:w="95" w:type="dxa"/>
-            </w:tcMar>
-          </w:tcPr>
-          <w:p>
-            <w:pPr>
-              <w:spacing w:after="60" w:before="60"/>
-            </w:pPr>
-            <w:r>
-              <w:rPr>
-                <w:b w:val="0"/>
-                <w:sz w:val="20"/>
-              </w:rPr>
-              <w:t>15 − 10</w:t>
-            </w:r>
-          </w:p>
-        </w:tc>
-      </w:tr>
-      <w:tr>
-        <w:trPr>
-          <w:cantSplit/>
-        </w:trPr>
-        <w:tc>
-          <w:tcPr>
-            <w:tcW w:type="dxa" w:w="3005"/>
-            <w:vAlign w:val="center"/>
-            <w:tcMar>
-              <w:top w:w="95" w:type="dxa"/>
-              <w:left w:w="95" w:type="dxa"/>
-              <w:bottom w:w="95" w:type="dxa"/>
-              <w:right w:w="95" w:type="dxa"/>
-            </w:tcMar>
-          </w:tcPr>
-          <w:p>
-            <w:pPr>
-              <w:spacing w:after="60" w:before="60"/>
-            </w:pPr>
-            <w:r>
-              <w:rPr>
-                <w:b w:val="0"/>
-                <w:sz w:val="20"/>
-              </w:rPr>
-              <w:t>申请金额与建议金额</w:t>
-            </w:r>
-          </w:p>
-        </w:tc>
-        <w:tc>
-          <w:tcPr>
-            <w:tcW w:type="dxa" w:w="2551"/>
-            <w:vAlign w:val="center"/>
-            <w:tcMar>
-              <w:top w:w="95" w:type="dxa"/>
-              <w:left w:w="95" w:type="dxa"/>
-              <w:bottom w:w="95" w:type="dxa"/>
-              <w:right w:w="95" w:type="dxa"/>
-            </w:tcMar>
-          </w:tcPr>
-          <w:p>
-            <w:pPr>
-              <w:spacing w:after="60" w:before="60"/>
-              <w:jc w:val="center"/>
-            </w:pPr>
-            <w:r>
-              <w:rPr>
-                <w:b w:val="0"/>
-                <w:sz w:val="20"/>
-              </w:rPr>
-              <w:t>187.50 元与 125.00 元</w:t>
-            </w:r>
-          </w:p>
-        </w:tc>
-        <w:tc>
-          <w:tcPr>
-            <w:tcW w:type="dxa" w:w="4082"/>
-            <w:vAlign w:val="center"/>
-            <w:tcMar>
-              <w:top w:w="95" w:type="dxa"/>
-              <w:left w:w="95" w:type="dxa"/>
-              <w:bottom w:w="95" w:type="dxa"/>
-              <w:right w:w="95" w:type="dxa"/>
-            </w:tcMar>
-          </w:tcPr>
-          <w:p>
-            <w:pPr>
-              <w:spacing w:after="60" w:before="60"/>
-            </w:pPr>
-            <w:r>
-              <w:rPr>
-                <w:b w:val="0"/>
-                <w:sz w:val="20"/>
-              </w:rPr>
-              <w:t>单价 12.50 元</w:t>
-            </w:r>
-          </w:p>
-        </w:tc>
-      </w:tr>
-      <w:tr>
-        <w:trPr>
-          <w:cantSplit/>
-        </w:trPr>
-        <w:tc>
-          <w:tcPr>
-            <w:tcW w:type="dxa" w:w="3005"/>
-            <w:vAlign w:val="center"/>
-            <w:tcMar>
-              <w:top w:w="95" w:type="dxa"/>
-              <w:left w:w="95" w:type="dxa"/>
-              <w:bottom w:w="95" w:type="dxa"/>
-              <w:right w:w="95" w:type="dxa"/>
-            </w:tcMar>
-          </w:tcPr>
-          <w:p>
-            <w:pPr>
-              <w:spacing w:after="60" w:before="60"/>
-            </w:pPr>
-            <w:r>
-              <w:rPr>
-                <w:b w:val="0"/>
-                <w:sz w:val="20"/>
-              </w:rPr>
-              <w:t>超额申请对应金额</w:t>
-            </w:r>
-          </w:p>
-        </w:tc>
-        <w:tc>
-          <w:tcPr>
-            <w:tcW w:type="dxa" w:w="2551"/>
-            <w:vAlign w:val="center"/>
-            <w:tcMar>
-              <w:top w:w="95" w:type="dxa"/>
-              <w:left w:w="95" w:type="dxa"/>
-              <w:bottom w:w="95" w:type="dxa"/>
-              <w:right w:w="95" w:type="dxa"/>
-            </w:tcMar>
-          </w:tcPr>
-          <w:p>
-            <w:pPr>
-              <w:spacing w:after="60" w:before="60"/>
-              <w:jc w:val="center"/>
-            </w:pPr>
-            <w:r>
-              <w:rPr>
-                <w:b w:val="0"/>
-                <w:sz w:val="20"/>
-              </w:rPr>
-              <w:t>62.50 元</w:t>
-            </w:r>
-          </w:p>
-        </w:tc>
-        <w:tc>
-          <w:tcPr>
-            <w:tcW w:type="dxa" w:w="4082"/>
-            <w:vAlign w:val="center"/>
-            <w:tcMar>
-              <w:top w:w="95" w:type="dxa"/>
-              <w:left w:w="95" w:type="dxa"/>
-              <w:bottom w:w="95" w:type="dxa"/>
-              <w:right w:w="95" w:type="dxa"/>
-            </w:tcMar>
-          </w:tcPr>
-          <w:p>
-            <w:pPr>
-              <w:spacing w:after="60" w:before="60"/>
-            </w:pPr>
-            <w:r>
-              <w:rPr>
-                <w:b w:val="0"/>
-                <w:sz w:val="20"/>
-              </w:rPr>
-              <w:t>5 × 12.50</w:t>
-            </w:r>
-          </w:p>
-        </w:tc>
-      </w:tr>
-    </w:tbl>
-    <w:p>
-      <w:pPr>
-        <w:spacing w:after="20"/>
-      </w:pPr>
-    </w:p>
-    <w:p>
-      <w:pPr/>
-      <w:r>
-        <w:t>系统据此标记库存与在途的重复风险，并提供测算和证据供审核。冻结、报废和完成采购不计入供应。62.50 元是本案例的超额申请对应金额，不能当作已经实现的降本收益。</w:t>
+        <w:t>业务人员申请采购某规格轴承。系统查到可用库存和未完成采购，同时存在冻结、报废库存及已完成历史订单，需要先厘清哪些记录能够用于本次需求。</w:t>
       </w:r>
     </w:p>
     <w:p>
       <w:pPr/>
       <w:r>
-        <w:t>审批者可以基于业务原因批准原申请；此时模拟 ERP 按批准的 15 个创建采购单并核验。若业务人员决定改为 10 个，应修改任务、重新生成提案并审批。等待审批期间写入为零，批准后执行一笔，重复恢复复用已有结果。</w:t>
+        <w:t>系统按物料身份和业务状态关联证据，扣除预留库存与已收货部分，排除不可用库存和已完成订单，再结合需求与安全库存测算缺口。若申请量超过建议量，提案呈现差异及依据，供审批者判断是否继续采购。</w:t>
+      </w:r>
+    </w:p>
+    <w:p>
+      <w:pPr/>
+      <w:r>
+        <w:t>审批者可以基于业务原因批准原申请；若业务人员决定调整数量，应修改任务、重新生成提案并审批。批准后模拟 ERP 按提案执行并核验，等待审批期间不写入，重复恢复复用已有结果，避免重复建单。</w:t>
       </w:r>
     </w:p>
     <w:p>
@@ -1165,7 +475,7 @@
         <w:t>MCP 与 CLI 适配层：</w:t>
       </w:r>
       <w:r>
-        <w:t xml:space="preserve"> 本地 stdio 服务提供四个只读数据工具；统一 DataSource、Zod 参数及结果 schema 将接入差异收敛为一致合约。固定子进程配置、超时与输出限制约束调用范围，模型无法生成任意 shell 命令。新的真实数据源需要遵循合约完成映射和校验。</w:t>
+        <w:t xml:space="preserve"> 本地 stdio 服务提供只读数据工具；统一 DataSource、Zod 参数及结果 schema 将接入差异收敛为一致合约。固定子进程配置、超时与输出限制约束调用范围，模型无法生成任意 shell 命令。新的真实数据源需要遵循合约完成映射和校验。</w:t>
       </w:r>
     </w:p>
     <w:p>
@@ -1189,7 +499,7 @@
         <w:t>测试与评测：</w:t>
       </w:r>
       <w:r>
-        <w:t xml:space="preserve"> Vitest 覆盖领域规则、会话隔离、MCP/CLI 子进程、pi 流适配、审批与故障恢复。Benchmark 使用独立标注检查检索、归因、重复识别、工具选择、权限违规、恢复和端到端七类指标，CI 在 Windows 与 Linux 的 Node.js 24 环境运行相同工程验证。</w:t>
+        <w:t xml:space="preserve"> Vitest 覆盖领域规则、会话隔离、MCP/CLI 子进程、pi 流适配、审批与故障恢复。Benchmark 使用独立标注检查检索、归因、重复识别、工具选择、权限违规、恢复和端到端结果，CI 在 Windows 与 Linux 的 Node.js 24 环境运行相同工程验证。</w:t>
       </w:r>
     </w:p>
     <w:p>
@@ -1201,7 +511,6 @@
     <w:p>
       <w:pPr>
         <w:pStyle w:val="Heading1"/>
-        <w:pageBreakBefore/>
       </w:pPr>
       <w:r>
         <w:t>六 当前验证结果与业务接入边界</w:t>
@@ -1210,589 +519,13 @@
     <w:p>
       <w:pPr/>
       <w:r>
-        <w:t>2026 年 10 月 6 日复核，53 项测试及 10 个固定合成 Benchmark 案例通过，未经授权的模拟 ERP 写入为零。既有交付记录中的类型检查、构建和 Windows/Linux CI 通过。案例覆盖采购、物料录入、歧义补充、数据缺失、审批批准与拒绝、重启及写后中断恢复。</w:t>
+        <w:t>现有测试与离线评测覆盖采购、物料录入、歧义补充、数据缺失、审批批准与拒绝、重启及写后中断恢复，并检查越权调用和重复执行。工程交付已完成类型检查、构建及 Windows/Linux CI 验证。</w:t>
       </w:r>
-    </w:p>
-    <w:tbl>
-      <w:tblPr>
-        <w:tblStyle w:val="TableGrid"/>
-        <w:tblW w:type="auto" w:w="0"/>
-        <w:tblLayout w:type="fixed"/>
-        <w:tblLook w:firstColumn="1" w:firstRow="1" w:lastColumn="0" w:lastRow="0" w:noHBand="0" w:noVBand="1" w:val="04A0"/>
-        <w:tblBorders>
-          <w:top w:val="single" w:sz="4" w:color="D9D9D9"/>
-          <w:left w:val="single" w:sz="4" w:color="D9D9D9"/>
-          <w:bottom w:val="single" w:sz="4" w:color="D9D9D9"/>
-          <w:right w:val="single" w:sz="4" w:color="D9D9D9"/>
-          <w:insideH w:val="single" w:sz="4" w:color="D9D9D9"/>
-          <w:insideV w:val="single" w:sz="4" w:color="D9D9D9"/>
-        </w:tblBorders>
-      </w:tblPr>
-      <w:tblGrid>
-        <w:gridCol w:w="3005"/>
-        <w:gridCol w:w="2551"/>
-        <w:gridCol w:w="4082"/>
-      </w:tblGrid>
-      <w:tr>
-        <w:trPr>
-          <w:cantSplit/>
-          <w:tblHeader/>
-        </w:trPr>
-        <w:tc>
-          <w:tcPr>
-            <w:tcW w:type="dxa" w:w="3005"/>
-            <w:vAlign w:val="center"/>
-            <w:tcMar>
-              <w:top w:w="95" w:type="dxa"/>
-              <w:left w:w="95" w:type="dxa"/>
-              <w:bottom w:w="95" w:type="dxa"/>
-              <w:right w:w="95" w:type="dxa"/>
-            </w:tcMar>
-            <w:shd w:fill="E9ECEF"/>
-          </w:tcPr>
-          <w:p>
-            <w:pPr>
-              <w:spacing w:after="60" w:before="60"/>
-            </w:pPr>
-            <w:r>
-              <w:rPr>
-                <w:b/>
-                <w:sz w:val="20"/>
-              </w:rPr>
-              <w:t>量化项目</w:t>
-            </w:r>
-          </w:p>
-        </w:tc>
-        <w:tc>
-          <w:tcPr>
-            <w:tcW w:type="dxa" w:w="2551"/>
-            <w:vAlign w:val="center"/>
-            <w:tcMar>
-              <w:top w:w="95" w:type="dxa"/>
-              <w:left w:w="95" w:type="dxa"/>
-              <w:bottom w:w="95" w:type="dxa"/>
-              <w:right w:w="95" w:type="dxa"/>
-            </w:tcMar>
-            <w:shd w:fill="E9ECEF"/>
-          </w:tcPr>
-          <w:p>
-            <w:pPr>
-              <w:spacing w:after="60" w:before="60"/>
-              <w:jc w:val="center"/>
-            </w:pPr>
-            <w:r>
-              <w:rPr>
-                <w:b/>
-                <w:sz w:val="20"/>
-              </w:rPr>
-              <w:t>本次结果</w:t>
-            </w:r>
-          </w:p>
-        </w:tc>
-        <w:tc>
-          <w:tcPr>
-            <w:tcW w:type="dxa" w:w="4082"/>
-            <w:vAlign w:val="center"/>
-            <w:tcMar>
-              <w:top w:w="95" w:type="dxa"/>
-              <w:left w:w="95" w:type="dxa"/>
-              <w:bottom w:w="95" w:type="dxa"/>
-              <w:right w:w="95" w:type="dxa"/>
-            </w:tcMar>
-            <w:shd w:fill="E9ECEF"/>
-          </w:tcPr>
-          <w:p>
-            <w:pPr>
-              <w:spacing w:after="60" w:before="60"/>
-            </w:pPr>
-            <w:r>
-              <w:rPr>
-                <w:b/>
-                <w:sz w:val="20"/>
-              </w:rPr>
-              <w:t>样本与计算口径</w:t>
-            </w:r>
-          </w:p>
-        </w:tc>
-      </w:tr>
-      <w:tr>
-        <w:trPr>
-          <w:cantSplit/>
-        </w:trPr>
-        <w:tc>
-          <w:tcPr>
-            <w:tcW w:type="dxa" w:w="3005"/>
-            <w:vAlign w:val="center"/>
-            <w:tcMar>
-              <w:top w:w="95" w:type="dxa"/>
-              <w:left w:w="95" w:type="dxa"/>
-              <w:bottom w:w="95" w:type="dxa"/>
-              <w:right w:w="95" w:type="dxa"/>
-            </w:tcMar>
-          </w:tcPr>
-          <w:p>
-            <w:pPr>
-              <w:spacing w:after="60" w:before="60"/>
-            </w:pPr>
-            <w:r>
-              <w:rPr>
-                <w:b w:val="0"/>
-                <w:sz w:val="20"/>
-              </w:rPr>
-              <w:t>物料检索 Top 5 命中</w:t>
-            </w:r>
-          </w:p>
-        </w:tc>
-        <w:tc>
-          <w:tcPr>
-            <w:tcW w:type="dxa" w:w="2551"/>
-            <w:vAlign w:val="center"/>
-            <w:tcMar>
-              <w:top w:w="95" w:type="dxa"/>
-              <w:left w:w="95" w:type="dxa"/>
-              <w:bottom w:w="95" w:type="dxa"/>
-              <w:right w:w="95" w:type="dxa"/>
-            </w:tcMar>
-          </w:tcPr>
-          <w:p>
-            <w:pPr>
-              <w:spacing w:after="60" w:before="60"/>
-              <w:jc w:val="center"/>
-            </w:pPr>
-            <w:r>
-              <w:rPr>
-                <w:b w:val="0"/>
-                <w:sz w:val="20"/>
-              </w:rPr>
-              <w:t>9/9</w:t>
-            </w:r>
-          </w:p>
-        </w:tc>
-        <w:tc>
-          <w:tcPr>
-            <w:tcW w:type="dxa" w:w="4082"/>
-            <w:vAlign w:val="center"/>
-            <w:tcMar>
-              <w:top w:w="95" w:type="dxa"/>
-              <w:left w:w="95" w:type="dxa"/>
-              <w:bottom w:w="95" w:type="dxa"/>
-              <w:right w:w="95" w:type="dxa"/>
-            </w:tcMar>
-          </w:tcPr>
-          <w:p>
-            <w:pPr>
-              <w:spacing w:after="60" w:before="60"/>
-            </w:pPr>
-            <w:r>
-              <w:rPr>
-                <w:b w:val="0"/>
-                <w:sz w:val="20"/>
-              </w:rPr>
-              <w:t>9 个含检索标签的案例 包含歧义候选</w:t>
-            </w:r>
-          </w:p>
-        </w:tc>
-      </w:tr>
-      <w:tr>
-        <w:trPr>
-          <w:cantSplit/>
-        </w:trPr>
-        <w:tc>
-          <w:tcPr>
-            <w:tcW w:type="dxa" w:w="3005"/>
-            <w:vAlign w:val="center"/>
-            <w:tcMar>
-              <w:top w:w="95" w:type="dxa"/>
-              <w:left w:w="95" w:type="dxa"/>
-              <w:bottom w:w="95" w:type="dxa"/>
-              <w:right w:w="95" w:type="dxa"/>
-            </w:tcMar>
-          </w:tcPr>
-          <w:p>
-            <w:pPr>
-              <w:spacing w:after="60" w:before="60"/>
-            </w:pPr>
-            <w:r>
-              <w:rPr>
-                <w:b w:val="0"/>
-                <w:sz w:val="20"/>
-              </w:rPr>
-              <w:t>物料身份归因一致</w:t>
-            </w:r>
-          </w:p>
-        </w:tc>
-        <w:tc>
-          <w:tcPr>
-            <w:tcW w:type="dxa" w:w="2551"/>
-            <w:vAlign w:val="center"/>
-            <w:tcMar>
-              <w:top w:w="95" w:type="dxa"/>
-              <w:left w:w="95" w:type="dxa"/>
-              <w:bottom w:w="95" w:type="dxa"/>
-              <w:right w:w="95" w:type="dxa"/>
-            </w:tcMar>
-          </w:tcPr>
-          <w:p>
-            <w:pPr>
-              <w:spacing w:after="60" w:before="60"/>
-              <w:jc w:val="center"/>
-            </w:pPr>
-            <w:r>
-              <w:rPr>
-                <w:b w:val="0"/>
-                <w:sz w:val="20"/>
-              </w:rPr>
-              <w:t>9/9</w:t>
-            </w:r>
-          </w:p>
-        </w:tc>
-        <w:tc>
-          <w:tcPr>
-            <w:tcW w:type="dxa" w:w="4082"/>
-            <w:vAlign w:val="center"/>
-            <w:tcMar>
-              <w:top w:w="95" w:type="dxa"/>
-              <w:left w:w="95" w:type="dxa"/>
-              <w:bottom w:w="95" w:type="dxa"/>
-              <w:right w:w="95" w:type="dxa"/>
-            </w:tcMar>
-          </w:tcPr>
-          <w:p>
-            <w:pPr>
-              <w:spacing w:after="60" w:before="60"/>
-            </w:pPr>
-            <w:r>
-              <w:rPr>
-                <w:b w:val="0"/>
-                <w:sz w:val="20"/>
-              </w:rPr>
-              <w:t>9 个含归因标签的案例 不评价解释质量</w:t>
-            </w:r>
-          </w:p>
-        </w:tc>
-      </w:tr>
-      <w:tr>
-        <w:trPr>
-          <w:cantSplit/>
-        </w:trPr>
-        <w:tc>
-          <w:tcPr>
-            <w:tcW w:type="dxa" w:w="3005"/>
-            <w:vAlign w:val="center"/>
-            <w:tcMar>
-              <w:top w:w="95" w:type="dxa"/>
-              <w:left w:w="95" w:type="dxa"/>
-              <w:bottom w:w="95" w:type="dxa"/>
-              <w:right w:w="95" w:type="dxa"/>
-            </w:tcMar>
-          </w:tcPr>
-          <w:p>
-            <w:pPr>
-              <w:spacing w:after="60" w:before="60"/>
-            </w:pPr>
-            <w:r>
-              <w:rPr>
-                <w:b w:val="0"/>
-                <w:sz w:val="20"/>
-              </w:rPr>
-              <w:t>成功工具序列位置匹配</w:t>
-            </w:r>
-          </w:p>
-        </w:tc>
-        <w:tc>
-          <w:tcPr>
-            <w:tcW w:type="dxa" w:w="2551"/>
-            <w:vAlign w:val="center"/>
-            <w:tcMar>
-              <w:top w:w="95" w:type="dxa"/>
-              <w:left w:w="95" w:type="dxa"/>
-              <w:bottom w:w="95" w:type="dxa"/>
-              <w:right w:w="95" w:type="dxa"/>
-            </w:tcMar>
-          </w:tcPr>
-          <w:p>
-            <w:pPr>
-              <w:spacing w:after="60" w:before="60"/>
-              <w:jc w:val="center"/>
-            </w:pPr>
-            <w:r>
-              <w:rPr>
-                <w:b w:val="0"/>
-                <w:sz w:val="20"/>
-              </w:rPr>
-              <w:t>78/78</w:t>
-            </w:r>
-          </w:p>
-        </w:tc>
-        <w:tc>
-          <w:tcPr>
-            <w:tcW w:type="dxa" w:w="4082"/>
-            <w:vAlign w:val="center"/>
-            <w:tcMar>
-              <w:top w:w="95" w:type="dxa"/>
-              <w:left w:w="95" w:type="dxa"/>
-              <w:bottom w:w="95" w:type="dxa"/>
-              <w:right w:w="95" w:type="dxa"/>
-            </w:tcMar>
-          </w:tcPr>
-          <w:p>
-            <w:pPr>
-              <w:spacing w:after="60" w:before="60"/>
-            </w:pPr>
-            <w:r>
-              <w:rPr>
-                <w:b w:val="0"/>
-                <w:sz w:val="20"/>
-              </w:rPr>
-              <w:t>10 个案例的成功工具结果与独立标注逐位置比较</w:t>
-            </w:r>
-          </w:p>
-        </w:tc>
-      </w:tr>
-      <w:tr>
-        <w:trPr>
-          <w:cantSplit/>
-        </w:trPr>
-        <w:tc>
-          <w:tcPr>
-            <w:tcW w:type="dxa" w:w="3005"/>
-            <w:vAlign w:val="center"/>
-            <w:tcMar>
-              <w:top w:w="95" w:type="dxa"/>
-              <w:left w:w="95" w:type="dxa"/>
-              <w:bottom w:w="95" w:type="dxa"/>
-              <w:right w:w="95" w:type="dxa"/>
-            </w:tcMar>
-          </w:tcPr>
-          <w:p>
-            <w:pPr>
-              <w:spacing w:after="60" w:before="60"/>
-            </w:pPr>
-            <w:r>
-              <w:rPr>
-                <w:b w:val="0"/>
-                <w:sz w:val="20"/>
-              </w:rPr>
-              <w:t>未经授权的模拟写入</w:t>
-            </w:r>
-          </w:p>
-        </w:tc>
-        <w:tc>
-          <w:tcPr>
-            <w:tcW w:type="dxa" w:w="2551"/>
-            <w:vAlign w:val="center"/>
-            <w:tcMar>
-              <w:top w:w="95" w:type="dxa"/>
-              <w:left w:w="95" w:type="dxa"/>
-              <w:bottom w:w="95" w:type="dxa"/>
-              <w:right w:w="95" w:type="dxa"/>
-            </w:tcMar>
-          </w:tcPr>
-          <w:p>
-            <w:pPr>
-              <w:spacing w:after="60" w:before="60"/>
-              <w:jc w:val="center"/>
-            </w:pPr>
-            <w:r>
-              <w:rPr>
-                <w:b w:val="0"/>
-                <w:sz w:val="20"/>
-              </w:rPr>
-              <w:t>0</w:t>
-            </w:r>
-          </w:p>
-        </w:tc>
-        <w:tc>
-          <w:tcPr>
-            <w:tcW w:type="dxa" w:w="4082"/>
-            <w:vAlign w:val="center"/>
-            <w:tcMar>
-              <w:top w:w="95" w:type="dxa"/>
-              <w:left w:w="95" w:type="dxa"/>
-              <w:bottom w:w="95" w:type="dxa"/>
-              <w:right w:w="95" w:type="dxa"/>
-            </w:tcMar>
-          </w:tcPr>
-          <w:p>
-            <w:pPr>
-              <w:spacing w:after="60" w:before="60"/>
-            </w:pPr>
-            <w:r>
-              <w:rPr>
-                <w:b w:val="0"/>
-                <w:sz w:val="20"/>
-              </w:rPr>
-              <w:t>10 个案例 检查审批前写入及包含越权探测</w:t>
-            </w:r>
-          </w:p>
-        </w:tc>
-      </w:tr>
-      <w:tr>
-        <w:trPr>
-          <w:cantSplit/>
-        </w:trPr>
-        <w:tc>
-          <w:tcPr>
-            <w:tcW w:type="dxa" w:w="3005"/>
-            <w:vAlign w:val="center"/>
-            <w:tcMar>
-              <w:top w:w="95" w:type="dxa"/>
-              <w:left w:w="95" w:type="dxa"/>
-              <w:bottom w:w="95" w:type="dxa"/>
-              <w:right w:w="95" w:type="dxa"/>
-            </w:tcMar>
-          </w:tcPr>
-          <w:p>
-            <w:pPr>
-              <w:spacing w:after="60" w:before="60"/>
-            </w:pPr>
-            <w:r>
-              <w:rPr>
-                <w:b w:val="0"/>
-                <w:sz w:val="20"/>
-              </w:rPr>
-              <w:t>恢复案例通过</w:t>
-            </w:r>
-          </w:p>
-        </w:tc>
-        <w:tc>
-          <w:tcPr>
-            <w:tcW w:type="dxa" w:w="2551"/>
-            <w:vAlign w:val="center"/>
-            <w:tcMar>
-              <w:top w:w="95" w:type="dxa"/>
-              <w:left w:w="95" w:type="dxa"/>
-              <w:bottom w:w="95" w:type="dxa"/>
-              <w:right w:w="95" w:type="dxa"/>
-            </w:tcMar>
-          </w:tcPr>
-          <w:p>
-            <w:pPr>
-              <w:spacing w:after="60" w:before="60"/>
-              <w:jc w:val="center"/>
-            </w:pPr>
-            <w:r>
-              <w:rPr>
-                <w:b w:val="0"/>
-                <w:sz w:val="20"/>
-              </w:rPr>
-              <w:t>2/2</w:t>
-            </w:r>
-          </w:p>
-        </w:tc>
-        <w:tc>
-          <w:tcPr>
-            <w:tcW w:type="dxa" w:w="4082"/>
-            <w:vAlign w:val="center"/>
-            <w:tcMar>
-              <w:top w:w="95" w:type="dxa"/>
-              <w:left w:w="95" w:type="dxa"/>
-              <w:bottom w:w="95" w:type="dxa"/>
-              <w:right w:w="95" w:type="dxa"/>
-            </w:tcMar>
-          </w:tcPr>
-          <w:p>
-            <w:pPr>
-              <w:spacing w:after="60" w:before="60"/>
-            </w:pPr>
-            <w:r>
-              <w:rPr>
-                <w:b w:val="0"/>
-                <w:sz w:val="20"/>
-              </w:rPr>
-              <w:t>重启与重复恢复 写后 checkpoint 中断且模型不可用</w:t>
-            </w:r>
-          </w:p>
-        </w:tc>
-      </w:tr>
-      <w:tr>
-        <w:trPr>
-          <w:cantSplit/>
-        </w:trPr>
-        <w:tc>
-          <w:tcPr>
-            <w:tcW w:type="dxa" w:w="3005"/>
-            <w:vAlign w:val="center"/>
-            <w:tcMar>
-              <w:top w:w="95" w:type="dxa"/>
-              <w:left w:w="95" w:type="dxa"/>
-              <w:bottom w:w="95" w:type="dxa"/>
-              <w:right w:w="95" w:type="dxa"/>
-            </w:tcMar>
-          </w:tcPr>
-          <w:p>
-            <w:pPr>
-              <w:spacing w:after="60" w:before="60"/>
-            </w:pPr>
-            <w:r>
-              <w:rPr>
-                <w:b w:val="0"/>
-                <w:sz w:val="20"/>
-              </w:rPr>
-              <w:t>恢复案例最终写入数</w:t>
-            </w:r>
-          </w:p>
-        </w:tc>
-        <w:tc>
-          <w:tcPr>
-            <w:tcW w:type="dxa" w:w="2551"/>
-            <w:vAlign w:val="center"/>
-            <w:tcMar>
-              <w:top w:w="95" w:type="dxa"/>
-              <w:left w:w="95" w:type="dxa"/>
-              <w:bottom w:w="95" w:type="dxa"/>
-              <w:right w:w="95" w:type="dxa"/>
-            </w:tcMar>
-          </w:tcPr>
-          <w:p>
-            <w:pPr>
-              <w:spacing w:after="60" w:before="60"/>
-              <w:jc w:val="center"/>
-            </w:pPr>
-            <w:r>
-              <w:rPr>
-                <w:b w:val="0"/>
-                <w:sz w:val="20"/>
-              </w:rPr>
-              <w:t>每例 1 笔</w:t>
-            </w:r>
-          </w:p>
-        </w:tc>
-        <w:tc>
-          <w:tcPr>
-            <w:tcW w:type="dxa" w:w="4082"/>
-            <w:vAlign w:val="center"/>
-            <w:tcMar>
-              <w:top w:w="95" w:type="dxa"/>
-              <w:left w:w="95" w:type="dxa"/>
-              <w:bottom w:w="95" w:type="dxa"/>
-              <w:right w:w="95" w:type="dxa"/>
-            </w:tcMar>
-          </w:tcPr>
-          <w:p>
-            <w:pPr>
-              <w:spacing w:after="60" w:before="60"/>
-            </w:pPr>
-            <w:r>
-              <w:rPr>
-                <w:b w:val="0"/>
-                <w:sz w:val="20"/>
-              </w:rPr>
-              <w:t>两个案例均恢复完成 重复运行未新增写入</w:t>
-            </w:r>
-          </w:p>
-        </w:tc>
-      </w:tr>
-    </w:tbl>
-    <w:p>
-      <w:pPr>
-        <w:spacing w:after="20"/>
-      </w:pPr>
     </w:p>
     <w:p>
       <w:pPr/>
       <w:r>
-        <w:t>检索与归因各有 9 个标签案例，两组样本不完全相同：新物料录入没有既有物料检索标签，未澄清的歧义案例没有唯一归因标签。工具序列按成功工具结果计分；被拦截或失败的调用另进入审计，不计为成功工具选择。恢复故障为受控注入，不代表生产断电或分布式压力验证。</w:t>
+        <w:t>离线评测使用固定合成场景，被拦截或失败的调用保留在审计记录中。恢复故障采用受控注入，不代表生产断电或分布式压力验证。</w:t>
       </w:r>
     </w:p>
     <w:p>

</xml_diff>